<commit_message>
RR69 close: handoff addendum (RR69b), launch docs
Co-Authored-By: Claude Fable 5.1 <noreply@anthropic.com>
Claude-Session: https://claude.ai/code/session_012EaptTeohtWznXjq1uXy6x
</commit_message>
<xml_diff>
--- a/RoamReady_Handoff_RR69.docx
+++ b/RoamReady_Handoff_RR69.docx
@@ -240,6 +240,182 @@
       </w:pPr>
       <w:r>
         <w:t>This recap: RoamReady_Handoff_RR69.docx (repo root).</w:t>
+      </w:r>
+    </w:p>
+    <w:p>
+      <w:pPr>
+        <w:pStyle w:val="Heading1"/>
+      </w:pPr>
+      <w:r>
+        <w:t>Afternoon addendum — RR69b (not pushed)</w:t>
+      </w:r>
+    </w:p>
+    <w:p>
+      <w:pPr>
+        <w:pStyle w:val="FirstParagraph"/>
+      </w:pPr>
+      <w:r>
+        <w:t>Saturday, September 5, 2026 · after the RR69 push · 22 commits on local main, no migration</w:t>
+      </w:r>
+    </w:p>
+    <w:p>
+      <w:pPr>
+        <w:pStyle w:val="Heading2"/>
+      </w:pPr>
+      <w:r>
+        <w:t>Built</w:t>
+      </w:r>
+    </w:p>
+    <w:p>
+      <w:pPr>
+        <w:pStyle w:val="Compact"/>
+      </w:pPr>
+      <w:r>
+        <w:t>PR-4 Share page — totals match the app (the share select had stripped every rate, so camping summed to $0); a one-way finish keeps its nights and campground; and a static route map now sits under the title (public, token-scoped, same renderer as the PDF cover) — the share modal's "route" promise is true.</w:t>
+      </w:r>
+    </w:p>
+    <w:p>
+      <w:pPr>
+        <w:pStyle w:val="Compact"/>
+      </w:pPr>
+      <w:r>
+        <w:t>PR-7 Off-route hazards — hazards are matched against the measured road (within 2 miles), not a 25-mile band around a straight line. Planning hands over the engine's route steps; the trip page reuses the map's cached polyline. Test: Kayenta → Blanding stays silent on Moki Dugway; Mexican Hat → Natural Bridges over UT-261 fires.</w:t>
+      </w:r>
+    </w:p>
+    <w:p>
+      <w:pPr>
+        <w:pStyle w:val="Compact"/>
+      </w:pPr>
+      <w:r>
+        <w:t>PR-6 Missing camping line — an overnight the engine inserted has no rate, so it priced at $0 and its row was hidden. It now takes the trip's average nightly rate (else $45), tagged "est. avg", on the summary and the PDF.</w:t>
+      </w:r>
+    </w:p>
+    <w:p>
+      <w:pPr>
+        <w:pStyle w:val="Compact"/>
+      </w:pPr>
+      <w:r>
+        <w:t>PR-3 Mileage drift — one source of truth: the server recomputes trip.totalMiles from the measured legs whenever stops change; the map page sums whole-mile legs; the booking page shows the measured leg instead of a straight-line guess.</w:t>
+      </w:r>
+    </w:p>
+    <w:p>
+      <w:pPr>
+        <w:pStyle w:val="Compact"/>
+      </w:pPr>
+      <w:r>
+        <w:t>Map sidebar readability (your mockup pick, Option A) — miles in RV blue, a nights chip, a green "Planned for your rig" or amber "Not planned for your rig" under each stop, and a filled banner at the TOP of the stops list. The amber never says "car routing" in a label (you were right — it read as a feature). The blue state names exactly what the rig is missing with a link: your Thor has no GVWR, which is why that whole trip was amber.</w:t>
+      </w:r>
+    </w:p>
+    <w:p>
+      <w:pPr>
+        <w:pStyle w:val="Compact"/>
+      </w:pPr>
+      <w:r>
+        <w:t>Rig dims required — height, length and weight are required on every rig form, with an "I don't know these yet — I'll add them later" checkbox that saves the rig but leaves an Incomplete badge on the profile until filled. Car camping is exempt everywhere (standard routing is right for a car; it gets a green line, never amber).</w:t>
+      </w:r>
+    </w:p>
+    <w:p>
+      <w:pPr>
+        <w:pStyle w:val="Compact"/>
+      </w:pPr>
+      <w:r>
+        <w:t>Helper-text contrast — every faded gray helper line site-wide darkened one step (2.5:1 → 4.8:1). Borders and icons untouched.</w:t>
+      </w:r>
+    </w:p>
+    <w:p>
+      <w:pPr>
+        <w:pStyle w:val="Compact"/>
+      </w:pPr>
+      <w:r>
+        <w:t>Tests — 30 automated checks for today's logic, runnable from Cowork via scripts/ts-test-register.mjs (no tsx needed). All green.</w:t>
+      </w:r>
+    </w:p>
+    <w:p>
+      <w:pPr>
+        <w:pStyle w:val="Heading2"/>
+      </w:pPr>
+      <w:r>
+        <w:t>Not verified tonight — your checklist for the morning (restart the backend first)</w:t>
+      </w:r>
+    </w:p>
+    <w:p>
+      <w:pPr>
+        <w:pStyle w:val="Compact"/>
+      </w:pPr>
+      <w:r>
+        <w:t>Add a rig without a weight → blocked with the red message; tick the box → saves and shows Incomplete on the profile. Pick Car Camping → no requirement.</w:t>
+      </w:r>
+    </w:p>
+    <w:p>
+      <w:pPr>
+        <w:pStyle w:val="Compact"/>
+      </w:pPr>
+      <w:r>
+        <w:t>Moab trip map page: banner at the top of the stops (blue for the Thor naming GVWR; green after you add it), per-stop lines one line each, miles readable.</w:t>
+      </w:r>
+    </w:p>
+    <w:p>
+      <w:pPr>
+        <w:pStyle w:val="Compact"/>
+      </w:pPr>
+      <w:r>
+        <w:t>Share link: total includes camping, the finish stop shows nights, and a route map is under the title.</w:t>
+      </w:r>
+    </w:p>
+    <w:p>
+      <w:pPr>
+        <w:pStyle w:val="Compact"/>
+      </w:pPr>
+      <w:r>
+        <w:t>Booking page: "N mi from previous stop" matches the itinerary. Dashboard, itinerary, share: the same mileage.</w:t>
+      </w:r>
+    </w:p>
+    <w:p>
+      <w:pPr>
+        <w:pStyle w:val="Compact"/>
+      </w:pPr>
+      <w:r>
+        <w:t>Itinerary cost breakdown on the Tonalea trip: an "est. avg" row for the overnight.</w:t>
+      </w:r>
+    </w:p>
+    <w:p>
+      <w:pPr>
+        <w:pStyle w:val="Compact"/>
+      </w:pPr>
+      <w:r>
+        <w:t>Then push: `RR69b: share map + sidebar readability + rig dims required + PR-3/4/6/7 review fixes + helper-text contrast + tests`.</w:t>
+      </w:r>
+    </w:p>
+    <w:p>
+      <w:pPr>
+        <w:pStyle w:val="Heading2"/>
+      </w:pPr>
+      <w:r>
+        <w:t>Then</w:t>
+      </w:r>
+    </w:p>
+    <w:p>
+      <w:pPr>
+        <w:pStyle w:val="Compact"/>
+      </w:pPr>
+      <w:r>
+        <w:t>Apple app scout (first thing, your call). Nightly replay task. PR-5 Journal Maps void and PR-10 PDF-export feedback are the last review items. GSPro spike on a day you pick.</w:t>
+      </w:r>
+    </w:p>
+    <w:p>
+      <w:pPr>
+        <w:pStyle w:val="Heading2"/>
+      </w:pPr>
+      <w:r>
+        <w:t>Files</w:t>
+      </w:r>
+    </w:p>
+    <w:p>
+      <w:pPr>
+        <w:pStyle w:val="Compact"/>
+      </w:pPr>
+      <w:r>
+        <w:t>Tracker: RoamReady_Bug_Tracker_RR69_v31.xlsx (repo root). This recap: RoamReady_Handoff_RR69.docx (addendum appended).</w:t>
       </w:r>
     </w:p>
     <w:sectPr/>

</xml_diff>

<commit_message>
RR69 close: dev verification recorded
Co-Authored-By: Claude Fable 5.1 <noreply@anthropic.com>
Claude-Session: https://claude.ai/code/session_012EaptTeohtWznXjq1uXy6x
</commit_message>
<xml_diff>
--- a/RoamReady_Handoff_RR69.docx
+++ b/RoamReady_Handoff_RR69.docx
@@ -255,7 +255,7 @@
         <w:pStyle w:val="FirstParagraph"/>
       </w:pPr>
       <w:r>
-        <w:t>Saturday, September 5, 2026 · after the RR69 push · 22 commits on local main, no migration</w:t>
+        <w:t>Saturday, September 5, 2026 · after the RR69 push · 24 commits on local main, no migration · verified on dev, ready to push</w:t>
       </w:r>
     </w:p>
     <w:p>
@@ -335,7 +335,7 @@
         <w:pStyle w:val="Heading2"/>
       </w:pPr>
       <w:r>
-        <w:t>Not verified tonight — your checklist for the morning (restart the backend first)</w:t>
+        <w:t>Verified on dev (Benny signed the browser pane in; Claude clicked through)</w:t>
       </w:r>
     </w:p>
     <w:p>

</xml_diff>